<commit_message>
Changes to make multipeer connections more stable
</commit_message>
<xml_diff>
--- a/Contract Whist Scorecard/Contract Whist Comms Protocols.docx
+++ b/Contract Whist Scorecard/Contract Whist Comms Protocols.docx
@@ -1,6 +1,6 @@
 
 <file path=word/document.xml><?xml version="1.0" encoding="utf-8"?>
-<w:document xmlns:wpc="http://schemas.microsoft.com/office/word/2010/wordprocessingCanvas" xmlns:cx="http://schemas.microsoft.com/office/drawing/2014/chartex" xmlns:cx1="http://schemas.microsoft.com/office/drawing/2015/9/8/chartex" xmlns:cx2="http://schemas.microsoft.com/office/drawing/2015/10/21/chartex" xmlns:cx3="http://schemas.microsoft.com/office/drawing/2016/5/9/chartex" xmlns:cx4="http://schemas.microsoft.com/office/drawing/2016/5/10/chartex" xmlns:cx5="http://schemas.microsoft.com/office/drawing/2016/5/11/chartex" xmlns:cx6="http://schemas.microsoft.com/office/drawing/2016/5/12/chartex" xmlns:cx7="http://schemas.microsoft.com/office/drawing/2016/5/13/chartex" xmlns:cx8="http://schemas.microsoft.com/office/drawing/2016/5/14/chartex" xmlns:mc="http://schemas.openxmlformats.org/markup-compatibility/2006" xmlns:aink="http://schemas.microsoft.com/office/drawing/2016/ink" xmlns:am3d="http://schemas.microsoft.com/office/drawing/2017/model3d" xmlns:o="urn:schemas-microsoft-com:office:office" xmlns:r="http://schemas.openxmlformats.org/officeDocument/2006/relationships" xmlns:m="http://schemas.openxmlformats.org/officeDocument/2006/math" xmlns:v="urn:schemas-microsoft-com:vml" xmlns:wp14="http://schemas.microsoft.com/office/word/2010/wordprocessingDrawing" xmlns:wp="http://schemas.openxmlformats.org/drawingml/2006/wordprocessingDrawing" xmlns:w10="urn:schemas-microsoft-com:office:word" xmlns:w="http://schemas.openxmlformats.org/wordprocessingml/2006/main" xmlns:w14="http://schemas.microsoft.com/office/word/2010/wordml" xmlns:w15="http://schemas.microsoft.com/office/word/2012/wordml" xmlns:w16cex="http://schemas.microsoft.com/office/word/2018/wordml/cex" xmlns:w16cid="http://schemas.microsoft.com/office/word/2016/wordml/cid" xmlns:w16="http://schemas.microsoft.com/office/word/2018/wordml" xmlns:w16se="http://schemas.microsoft.com/office/word/2015/wordml/symex" xmlns:wpg="http://schemas.microsoft.com/office/word/2010/wordprocessingGroup" xmlns:wpi="http://schemas.microsoft.com/office/word/2010/wordprocessingInk" xmlns:wne="http://schemas.microsoft.com/office/word/2006/wordml" xmlns:wps="http://schemas.microsoft.com/office/word/2010/wordprocessingShape" mc:Ignorable="w14 w15 w16se w16cid w16 w16cex wp14">
+<w:document xmlns:wpc="http://schemas.microsoft.com/office/word/2010/wordprocessingCanvas" xmlns:cx="http://schemas.microsoft.com/office/drawing/2014/chartex" xmlns:cx1="http://schemas.microsoft.com/office/drawing/2015/9/8/chartex" xmlns:cx2="http://schemas.microsoft.com/office/drawing/2015/10/21/chartex" xmlns:cx3="http://schemas.microsoft.com/office/drawing/2016/5/9/chartex" xmlns:cx4="http://schemas.microsoft.com/office/drawing/2016/5/10/chartex" xmlns:cx5="http://schemas.microsoft.com/office/drawing/2016/5/11/chartex" xmlns:cx6="http://schemas.microsoft.com/office/drawing/2016/5/12/chartex" xmlns:cx7="http://schemas.microsoft.com/office/drawing/2016/5/13/chartex" xmlns:cx8="http://schemas.microsoft.com/office/drawing/2016/5/14/chartex" xmlns:mc="http://schemas.openxmlformats.org/markup-compatibility/2006" xmlns:aink="http://schemas.microsoft.com/office/drawing/2016/ink" xmlns:am3d="http://schemas.microsoft.com/office/drawing/2017/model3d" xmlns:o="urn:schemas-microsoft-com:office:office" xmlns:oel="http://schemas.microsoft.com/office/2019/extlst" xmlns:r="http://schemas.openxmlformats.org/officeDocument/2006/relationships" xmlns:m="http://schemas.openxmlformats.org/officeDocument/2006/math" xmlns:v="urn:schemas-microsoft-com:vml" xmlns:wp14="http://schemas.microsoft.com/office/word/2010/wordprocessingDrawing" xmlns:wp="http://schemas.openxmlformats.org/drawingml/2006/wordprocessingDrawing" xmlns:w10="urn:schemas-microsoft-com:office:word" xmlns:w="http://schemas.openxmlformats.org/wordprocessingml/2006/main" xmlns:w14="http://schemas.microsoft.com/office/word/2010/wordml" xmlns:w15="http://schemas.microsoft.com/office/word/2012/wordml" xmlns:w16cex="http://schemas.microsoft.com/office/word/2018/wordml/cex" xmlns:w16cid="http://schemas.microsoft.com/office/word/2016/wordml/cid" xmlns:w16="http://schemas.microsoft.com/office/word/2018/wordml" xmlns:w16du="http://schemas.microsoft.com/office/word/2023/wordml/word16du" xmlns:w16sdtdh="http://schemas.microsoft.com/office/word/2020/wordml/sdtdatahash" xmlns:w16sdtfl="http://schemas.microsoft.com/office/word/2024/wordml/sdtformatlock" xmlns:w16se="http://schemas.microsoft.com/office/word/2015/wordml/symex" xmlns:wpg="http://schemas.microsoft.com/office/word/2010/wordprocessingGroup" xmlns:wpi="http://schemas.microsoft.com/office/word/2010/wordprocessingInk" xmlns:wne="http://schemas.microsoft.com/office/word/2006/wordml" xmlns:wps="http://schemas.microsoft.com/office/word/2010/wordprocessingShape" mc:Ignorable="w14 w15 w16se w16cid w16 w16cex w16sdtdh w16sdtfl w16du wp14">
   <w:body>
     <w:p>
       <w:r>
@@ -1034,7 +1034,7 @@
         <w:t xml:space="preserve"> as the service URI is derived within the communication handler.</w:t>
       </w:r>
       <w:r>
-        <w:t xml:space="preserve"> However, this should not be assumed in. the application which should provide an ID in case a future communications protocol requires it.</w:t>
+        <w:t xml:space="preserve"> However, this should not be assumed in the application which should provide an ID in case a future communications protocol requires it.</w:t>
       </w:r>
     </w:p>
     <w:p>
@@ -2093,28 +2093,7 @@
         <w:t>. This queue will be shared by all remote players. Each message will contain a list of player emails. If a device receives a message on a queue for an email other than itself, it simply ignores it.</w:t>
       </w:r>
       <w:r>
-        <w:t xml:space="preserve"> </w:t>
-      </w:r>
-      <w:r>
-        <w:t xml:space="preserve">If a server is starting as part of a recovery process (where the server device has crashed), it will </w:t>
-      </w:r>
-      <w:r>
-        <w:t>receive</w:t>
-      </w:r>
-      <w:r>
-        <w:t xml:space="preserve"> the name of the queue to use</w:t>
-      </w:r>
-      <w:r>
-        <w:t xml:space="preserve"> from the application and</w:t>
-      </w:r>
-      <w:r>
-        <w:t xml:space="preserve"> it</w:t>
-      </w:r>
-      <w:r>
-        <w:t xml:space="preserve"> will</w:t>
-      </w:r>
-      <w:r>
-        <w:t xml:space="preserve"> simply re-</w:t>
+        <w:t xml:space="preserve"> If a server is starting as part of a recovery process (where the server device has crashed), it will receive the name of the queue to use from the application and it will simply re-</w:t>
       </w:r>
       <w:proofErr w:type="gramStart"/>
       <w:r>
@@ -2162,8 +2141,6 @@
       </w:r>
       <w:r>
         <w:tab/>
-      </w:r>
-      <w:r>
         <w:t xml:space="preserve"> in the iCloud datab</w:t>
       </w:r>
       <w:r>
@@ -2233,22 +2210,7 @@
         </w:numPr>
       </w:pPr>
       <w:r>
-        <w:t>The handler state is set to ‘</w:t>
-      </w:r>
-      <w:r>
-        <w:t>invited’</w:t>
-      </w:r>
-      <w:r>
-        <w:t xml:space="preserve"> (or ‘</w:t>
-      </w:r>
-      <w:r>
-        <w:t>notStarted’</w:t>
-      </w:r>
-      <w:r>
-        <w:t xml:space="preserve"> if </w:t>
-      </w:r>
-      <w:r>
-        <w:t>any of the above fails).</w:t>
+        <w:t>The handler state is set to ‘invited’ (or ‘notStarted’ if any of the above fails).</w:t>
       </w:r>
     </w:p>
     <w:p>
@@ -2284,35 +2246,7 @@
           <w:rFonts w:eastAsiaTheme="minorHAnsi"/>
           <w:lang w:eastAsia="en-US"/>
         </w:rPr>
-        <w:t xml:space="preserve">The </w:t>
-      </w:r>
-      <w:r>
-        <w:rPr>
-          <w:rFonts w:eastAsiaTheme="minorHAnsi"/>
-          <w:lang w:eastAsia="en-US"/>
-        </w:rPr>
-        <w:t>Client</w:t>
-      </w:r>
-      <w:r>
-        <w:rPr>
-          <w:rFonts w:eastAsiaTheme="minorHAnsi"/>
-          <w:lang w:eastAsia="en-US"/>
-        </w:rPr>
-        <w:t xml:space="preserve"> Invitation </w:t>
-      </w:r>
-      <w:r>
-        <w:rPr>
-          <w:rFonts w:eastAsiaTheme="minorHAnsi"/>
-          <w:lang w:eastAsia="en-US"/>
-        </w:rPr>
-        <w:t xml:space="preserve">Receipt </w:t>
-      </w:r>
-      <w:r>
-        <w:rPr>
-          <w:rFonts w:eastAsiaTheme="minorHAnsi"/>
-          <w:lang w:eastAsia="en-US"/>
-        </w:rPr>
-        <w:t>Process</w:t>
+        <w:t>The Client Invitation Receipt Process</w:t>
       </w:r>
     </w:p>
     <w:p>
@@ -2355,14 +2289,7 @@
           <w:rFonts w:eastAsiaTheme="minorHAnsi"/>
           <w:lang w:eastAsia="en-US"/>
         </w:rPr>
-        <w:t xml:space="preserve"> </w:t>
-      </w:r>
-      <w:r>
-        <w:rPr>
-          <w:rFonts w:eastAsiaTheme="minorHAnsi"/>
-          <w:lang w:eastAsia="en-US"/>
-        </w:rPr>
-        <w:t>Alternatively the user can just go into the Play Game option manually.</w:t>
+        <w:t xml:space="preserve"> Alternatively the user can just go into the Play Game option manually.</w:t>
       </w:r>
     </w:p>
     <w:p>
@@ -2537,7 +2464,7 @@
 </file>
 
 <file path=word/endnotes.xml><?xml version="1.0" encoding="utf-8"?>
-<w:endnotes xmlns:wpc="http://schemas.microsoft.com/office/word/2010/wordprocessingCanvas" xmlns:cx="http://schemas.microsoft.com/office/drawing/2014/chartex" xmlns:cx1="http://schemas.microsoft.com/office/drawing/2015/9/8/chartex" xmlns:cx2="http://schemas.microsoft.com/office/drawing/2015/10/21/chartex" xmlns:cx3="http://schemas.microsoft.com/office/drawing/2016/5/9/chartex" xmlns:cx4="http://schemas.microsoft.com/office/drawing/2016/5/10/chartex" xmlns:cx5="http://schemas.microsoft.com/office/drawing/2016/5/11/chartex" xmlns:cx6="http://schemas.microsoft.com/office/drawing/2016/5/12/chartex" xmlns:cx7="http://schemas.microsoft.com/office/drawing/2016/5/13/chartex" xmlns:cx8="http://schemas.microsoft.com/office/drawing/2016/5/14/chartex" xmlns:mc="http://schemas.openxmlformats.org/markup-compatibility/2006" xmlns:aink="http://schemas.microsoft.com/office/drawing/2016/ink" xmlns:am3d="http://schemas.microsoft.com/office/drawing/2017/model3d" xmlns:o="urn:schemas-microsoft-com:office:office" xmlns:r="http://schemas.openxmlformats.org/officeDocument/2006/relationships" xmlns:m="http://schemas.openxmlformats.org/officeDocument/2006/math" xmlns:v="urn:schemas-microsoft-com:vml" xmlns:wp14="http://schemas.microsoft.com/office/word/2010/wordprocessingDrawing" xmlns:wp="http://schemas.openxmlformats.org/drawingml/2006/wordprocessingDrawing" xmlns:w10="urn:schemas-microsoft-com:office:word" xmlns:w="http://schemas.openxmlformats.org/wordprocessingml/2006/main" xmlns:w14="http://schemas.microsoft.com/office/word/2010/wordml" xmlns:w15="http://schemas.microsoft.com/office/word/2012/wordml" xmlns:w16cex="http://schemas.microsoft.com/office/word/2018/wordml/cex" xmlns:w16cid="http://schemas.microsoft.com/office/word/2016/wordml/cid" xmlns:w16="http://schemas.microsoft.com/office/word/2018/wordml" xmlns:w16se="http://schemas.microsoft.com/office/word/2015/wordml/symex" xmlns:wpg="http://schemas.microsoft.com/office/word/2010/wordprocessingGroup" xmlns:wpi="http://schemas.microsoft.com/office/word/2010/wordprocessingInk" xmlns:wne="http://schemas.microsoft.com/office/word/2006/wordml" xmlns:wps="http://schemas.microsoft.com/office/word/2010/wordprocessingShape" mc:Ignorable="w14 w15 w16se w16cid w16 w16cex wp14">
+<w:endnotes xmlns:wpc="http://schemas.microsoft.com/office/word/2010/wordprocessingCanvas" xmlns:cx="http://schemas.microsoft.com/office/drawing/2014/chartex" xmlns:cx1="http://schemas.microsoft.com/office/drawing/2015/9/8/chartex" xmlns:cx2="http://schemas.microsoft.com/office/drawing/2015/10/21/chartex" xmlns:cx3="http://schemas.microsoft.com/office/drawing/2016/5/9/chartex" xmlns:cx4="http://schemas.microsoft.com/office/drawing/2016/5/10/chartex" xmlns:cx5="http://schemas.microsoft.com/office/drawing/2016/5/11/chartex" xmlns:cx6="http://schemas.microsoft.com/office/drawing/2016/5/12/chartex" xmlns:cx7="http://schemas.microsoft.com/office/drawing/2016/5/13/chartex" xmlns:cx8="http://schemas.microsoft.com/office/drawing/2016/5/14/chartex" xmlns:mc="http://schemas.openxmlformats.org/markup-compatibility/2006" xmlns:aink="http://schemas.microsoft.com/office/drawing/2016/ink" xmlns:am3d="http://schemas.microsoft.com/office/drawing/2017/model3d" xmlns:o="urn:schemas-microsoft-com:office:office" xmlns:oel="http://schemas.microsoft.com/office/2019/extlst" xmlns:r="http://schemas.openxmlformats.org/officeDocument/2006/relationships" xmlns:m="http://schemas.openxmlformats.org/officeDocument/2006/math" xmlns:v="urn:schemas-microsoft-com:vml" xmlns:wp14="http://schemas.microsoft.com/office/word/2010/wordprocessingDrawing" xmlns:wp="http://schemas.openxmlformats.org/drawingml/2006/wordprocessingDrawing" xmlns:w10="urn:schemas-microsoft-com:office:word" xmlns:w="http://schemas.openxmlformats.org/wordprocessingml/2006/main" xmlns:w14="http://schemas.microsoft.com/office/word/2010/wordml" xmlns:w15="http://schemas.microsoft.com/office/word/2012/wordml" xmlns:w16cex="http://schemas.microsoft.com/office/word/2018/wordml/cex" xmlns:w16cid="http://schemas.microsoft.com/office/word/2016/wordml/cid" xmlns:w16="http://schemas.microsoft.com/office/word/2018/wordml" xmlns:w16du="http://schemas.microsoft.com/office/word/2023/wordml/word16du" xmlns:w16sdtdh="http://schemas.microsoft.com/office/word/2020/wordml/sdtdatahash" xmlns:w16sdtfl="http://schemas.microsoft.com/office/word/2024/wordml/sdtformatlock" xmlns:w16se="http://schemas.microsoft.com/office/word/2015/wordml/symex" xmlns:wpg="http://schemas.microsoft.com/office/word/2010/wordprocessingGroup" xmlns:wpi="http://schemas.microsoft.com/office/word/2010/wordprocessingInk" xmlns:wne="http://schemas.microsoft.com/office/word/2006/wordml" xmlns:wps="http://schemas.microsoft.com/office/word/2010/wordprocessingShape" mc:Ignorable="w14 w15 w16se w16cid w16 w16cex w16sdtdh w16sdtfl w16du wp14">
   <w:endnote w:type="separator" w:id="-1">
     <w:p>
       <w:pPr>
@@ -2562,7 +2489,7 @@
 </file>
 
 <file path=word/footer1.xml><?xml version="1.0" encoding="utf-8"?>
-<w:ftr xmlns:wpc="http://schemas.microsoft.com/office/word/2010/wordprocessingCanvas" xmlns:cx="http://schemas.microsoft.com/office/drawing/2014/chartex" xmlns:cx1="http://schemas.microsoft.com/office/drawing/2015/9/8/chartex" xmlns:cx2="http://schemas.microsoft.com/office/drawing/2015/10/21/chartex" xmlns:cx3="http://schemas.microsoft.com/office/drawing/2016/5/9/chartex" xmlns:cx4="http://schemas.microsoft.com/office/drawing/2016/5/10/chartex" xmlns:cx5="http://schemas.microsoft.com/office/drawing/2016/5/11/chartex" xmlns:cx6="http://schemas.microsoft.com/office/drawing/2016/5/12/chartex" xmlns:cx7="http://schemas.microsoft.com/office/drawing/2016/5/13/chartex" xmlns:cx8="http://schemas.microsoft.com/office/drawing/2016/5/14/chartex" xmlns:mc="http://schemas.openxmlformats.org/markup-compatibility/2006" xmlns:aink="http://schemas.microsoft.com/office/drawing/2016/ink" xmlns:am3d="http://schemas.microsoft.com/office/drawing/2017/model3d" xmlns:o="urn:schemas-microsoft-com:office:office" xmlns:r="http://schemas.openxmlformats.org/officeDocument/2006/relationships" xmlns:m="http://schemas.openxmlformats.org/officeDocument/2006/math" xmlns:v="urn:schemas-microsoft-com:vml" xmlns:wp14="http://schemas.microsoft.com/office/word/2010/wordprocessingDrawing" xmlns:wp="http://schemas.openxmlformats.org/drawingml/2006/wordprocessingDrawing" xmlns:w10="urn:schemas-microsoft-com:office:word" xmlns:w="http://schemas.openxmlformats.org/wordprocessingml/2006/main" xmlns:w14="http://schemas.microsoft.com/office/word/2010/wordml" xmlns:w15="http://schemas.microsoft.com/office/word/2012/wordml" xmlns:w16cex="http://schemas.microsoft.com/office/word/2018/wordml/cex" xmlns:w16cid="http://schemas.microsoft.com/office/word/2016/wordml/cid" xmlns:w16="http://schemas.microsoft.com/office/word/2018/wordml" xmlns:w16se="http://schemas.microsoft.com/office/word/2015/wordml/symex" xmlns:wpg="http://schemas.microsoft.com/office/word/2010/wordprocessingGroup" xmlns:wpi="http://schemas.microsoft.com/office/word/2010/wordprocessingInk" xmlns:wne="http://schemas.microsoft.com/office/word/2006/wordml" xmlns:wps="http://schemas.microsoft.com/office/word/2010/wordprocessingShape" mc:Ignorable="w14 w15 w16se w16cid w16 w16cex wp14">
+<w:ftr xmlns:wpc="http://schemas.microsoft.com/office/word/2010/wordprocessingCanvas" xmlns:cx="http://schemas.microsoft.com/office/drawing/2014/chartex" xmlns:cx1="http://schemas.microsoft.com/office/drawing/2015/9/8/chartex" xmlns:cx2="http://schemas.microsoft.com/office/drawing/2015/10/21/chartex" xmlns:cx3="http://schemas.microsoft.com/office/drawing/2016/5/9/chartex" xmlns:cx4="http://schemas.microsoft.com/office/drawing/2016/5/10/chartex" xmlns:cx5="http://schemas.microsoft.com/office/drawing/2016/5/11/chartex" xmlns:cx6="http://schemas.microsoft.com/office/drawing/2016/5/12/chartex" xmlns:cx7="http://schemas.microsoft.com/office/drawing/2016/5/13/chartex" xmlns:cx8="http://schemas.microsoft.com/office/drawing/2016/5/14/chartex" xmlns:mc="http://schemas.openxmlformats.org/markup-compatibility/2006" xmlns:aink="http://schemas.microsoft.com/office/drawing/2016/ink" xmlns:am3d="http://schemas.microsoft.com/office/drawing/2017/model3d" xmlns:o="urn:schemas-microsoft-com:office:office" xmlns:oel="http://schemas.microsoft.com/office/2019/extlst" xmlns:r="http://schemas.openxmlformats.org/officeDocument/2006/relationships" xmlns:m="http://schemas.openxmlformats.org/officeDocument/2006/math" xmlns:v="urn:schemas-microsoft-com:vml" xmlns:wp14="http://schemas.microsoft.com/office/word/2010/wordprocessingDrawing" xmlns:wp="http://schemas.openxmlformats.org/drawingml/2006/wordprocessingDrawing" xmlns:w10="urn:schemas-microsoft-com:office:word" xmlns:w="http://schemas.openxmlformats.org/wordprocessingml/2006/main" xmlns:w14="http://schemas.microsoft.com/office/word/2010/wordml" xmlns:w15="http://schemas.microsoft.com/office/word/2012/wordml" xmlns:w16cex="http://schemas.microsoft.com/office/word/2018/wordml/cex" xmlns:w16cid="http://schemas.microsoft.com/office/word/2016/wordml/cid" xmlns:w16="http://schemas.microsoft.com/office/word/2018/wordml" xmlns:w16du="http://schemas.microsoft.com/office/word/2023/wordml/word16du" xmlns:w16sdtdh="http://schemas.microsoft.com/office/word/2020/wordml/sdtdatahash" xmlns:w16sdtfl="http://schemas.microsoft.com/office/word/2024/wordml/sdtformatlock" xmlns:w16se="http://schemas.microsoft.com/office/word/2015/wordml/symex" xmlns:wpg="http://schemas.microsoft.com/office/word/2010/wordprocessingGroup" xmlns:wpi="http://schemas.microsoft.com/office/word/2010/wordprocessingInk" xmlns:wne="http://schemas.microsoft.com/office/word/2006/wordml" xmlns:wps="http://schemas.microsoft.com/office/word/2010/wordprocessingShape" mc:Ignorable="w14 w15 w16se w16cid w16 w16cex w16sdtdh w16sdtfl w16du wp14">
   <w:p>
     <w:pPr>
       <w:pStyle w:val="Footer"/>
@@ -2572,7 +2499,7 @@
 </file>
 
 <file path=word/footer2.xml><?xml version="1.0" encoding="utf-8"?>
-<w:ftr xmlns:wpc="http://schemas.microsoft.com/office/word/2010/wordprocessingCanvas" xmlns:cx="http://schemas.microsoft.com/office/drawing/2014/chartex" xmlns:cx1="http://schemas.microsoft.com/office/drawing/2015/9/8/chartex" xmlns:cx2="http://schemas.microsoft.com/office/drawing/2015/10/21/chartex" xmlns:cx3="http://schemas.microsoft.com/office/drawing/2016/5/9/chartex" xmlns:cx4="http://schemas.microsoft.com/office/drawing/2016/5/10/chartex" xmlns:cx5="http://schemas.microsoft.com/office/drawing/2016/5/11/chartex" xmlns:cx6="http://schemas.microsoft.com/office/drawing/2016/5/12/chartex" xmlns:cx7="http://schemas.microsoft.com/office/drawing/2016/5/13/chartex" xmlns:cx8="http://schemas.microsoft.com/office/drawing/2016/5/14/chartex" xmlns:mc="http://schemas.openxmlformats.org/markup-compatibility/2006" xmlns:aink="http://schemas.microsoft.com/office/drawing/2016/ink" xmlns:am3d="http://schemas.microsoft.com/office/drawing/2017/model3d" xmlns:o="urn:schemas-microsoft-com:office:office" xmlns:r="http://schemas.openxmlformats.org/officeDocument/2006/relationships" xmlns:m="http://schemas.openxmlformats.org/officeDocument/2006/math" xmlns:v="urn:schemas-microsoft-com:vml" xmlns:wp14="http://schemas.microsoft.com/office/word/2010/wordprocessingDrawing" xmlns:wp="http://schemas.openxmlformats.org/drawingml/2006/wordprocessingDrawing" xmlns:w10="urn:schemas-microsoft-com:office:word" xmlns:w="http://schemas.openxmlformats.org/wordprocessingml/2006/main" xmlns:w14="http://schemas.microsoft.com/office/word/2010/wordml" xmlns:w15="http://schemas.microsoft.com/office/word/2012/wordml" xmlns:w16cex="http://schemas.microsoft.com/office/word/2018/wordml/cex" xmlns:w16cid="http://schemas.microsoft.com/office/word/2016/wordml/cid" xmlns:w16="http://schemas.microsoft.com/office/word/2018/wordml" xmlns:w16se="http://schemas.microsoft.com/office/word/2015/wordml/symex" xmlns:wpg="http://schemas.microsoft.com/office/word/2010/wordprocessingGroup" xmlns:wpi="http://schemas.microsoft.com/office/word/2010/wordprocessingInk" xmlns:wne="http://schemas.microsoft.com/office/word/2006/wordml" xmlns:wps="http://schemas.microsoft.com/office/word/2010/wordprocessingShape" mc:Ignorable="w14 w15 w16se w16cid w16 w16cex wp14">
+<w:ftr xmlns:wpc="http://schemas.microsoft.com/office/word/2010/wordprocessingCanvas" xmlns:cx="http://schemas.microsoft.com/office/drawing/2014/chartex" xmlns:cx1="http://schemas.microsoft.com/office/drawing/2015/9/8/chartex" xmlns:cx2="http://schemas.microsoft.com/office/drawing/2015/10/21/chartex" xmlns:cx3="http://schemas.microsoft.com/office/drawing/2016/5/9/chartex" xmlns:cx4="http://schemas.microsoft.com/office/drawing/2016/5/10/chartex" xmlns:cx5="http://schemas.microsoft.com/office/drawing/2016/5/11/chartex" xmlns:cx6="http://schemas.microsoft.com/office/drawing/2016/5/12/chartex" xmlns:cx7="http://schemas.microsoft.com/office/drawing/2016/5/13/chartex" xmlns:cx8="http://schemas.microsoft.com/office/drawing/2016/5/14/chartex" xmlns:mc="http://schemas.openxmlformats.org/markup-compatibility/2006" xmlns:aink="http://schemas.microsoft.com/office/drawing/2016/ink" xmlns:am3d="http://schemas.microsoft.com/office/drawing/2017/model3d" xmlns:o="urn:schemas-microsoft-com:office:office" xmlns:oel="http://schemas.microsoft.com/office/2019/extlst" xmlns:r="http://schemas.openxmlformats.org/officeDocument/2006/relationships" xmlns:m="http://schemas.openxmlformats.org/officeDocument/2006/math" xmlns:v="urn:schemas-microsoft-com:vml" xmlns:wp14="http://schemas.microsoft.com/office/word/2010/wordprocessingDrawing" xmlns:wp="http://schemas.openxmlformats.org/drawingml/2006/wordprocessingDrawing" xmlns:w10="urn:schemas-microsoft-com:office:word" xmlns:w="http://schemas.openxmlformats.org/wordprocessingml/2006/main" xmlns:w14="http://schemas.microsoft.com/office/word/2010/wordml" xmlns:w15="http://schemas.microsoft.com/office/word/2012/wordml" xmlns:w16cex="http://schemas.microsoft.com/office/word/2018/wordml/cex" xmlns:w16cid="http://schemas.microsoft.com/office/word/2016/wordml/cid" xmlns:w16="http://schemas.microsoft.com/office/word/2018/wordml" xmlns:w16du="http://schemas.microsoft.com/office/word/2023/wordml/word16du" xmlns:w16sdtdh="http://schemas.microsoft.com/office/word/2020/wordml/sdtdatahash" xmlns:w16sdtfl="http://schemas.microsoft.com/office/word/2024/wordml/sdtformatlock" xmlns:w16se="http://schemas.microsoft.com/office/word/2015/wordml/symex" xmlns:wpg="http://schemas.microsoft.com/office/word/2010/wordprocessingGroup" xmlns:wpi="http://schemas.microsoft.com/office/word/2010/wordprocessingInk" xmlns:wne="http://schemas.microsoft.com/office/word/2006/wordml" xmlns:wps="http://schemas.microsoft.com/office/word/2010/wordprocessingShape" mc:Ignorable="w14 w15 w16se w16cid w16 w16cex w16sdtdh w16sdtfl w16du wp14">
   <w:p>
     <w:pPr>
       <w:pStyle w:val="Footer"/>
@@ -2667,7 +2594,7 @@
 </file>
 
 <file path=word/footer3.xml><?xml version="1.0" encoding="utf-8"?>
-<w:ftr xmlns:wpc="http://schemas.microsoft.com/office/word/2010/wordprocessingCanvas" xmlns:cx="http://schemas.microsoft.com/office/drawing/2014/chartex" xmlns:cx1="http://schemas.microsoft.com/office/drawing/2015/9/8/chartex" xmlns:cx2="http://schemas.microsoft.com/office/drawing/2015/10/21/chartex" xmlns:cx3="http://schemas.microsoft.com/office/drawing/2016/5/9/chartex" xmlns:cx4="http://schemas.microsoft.com/office/drawing/2016/5/10/chartex" xmlns:cx5="http://schemas.microsoft.com/office/drawing/2016/5/11/chartex" xmlns:cx6="http://schemas.microsoft.com/office/drawing/2016/5/12/chartex" xmlns:cx7="http://schemas.microsoft.com/office/drawing/2016/5/13/chartex" xmlns:cx8="http://schemas.microsoft.com/office/drawing/2016/5/14/chartex" xmlns:mc="http://schemas.openxmlformats.org/markup-compatibility/2006" xmlns:aink="http://schemas.microsoft.com/office/drawing/2016/ink" xmlns:am3d="http://schemas.microsoft.com/office/drawing/2017/model3d" xmlns:o="urn:schemas-microsoft-com:office:office" xmlns:r="http://schemas.openxmlformats.org/officeDocument/2006/relationships" xmlns:m="http://schemas.openxmlformats.org/officeDocument/2006/math" xmlns:v="urn:schemas-microsoft-com:vml" xmlns:wp14="http://schemas.microsoft.com/office/word/2010/wordprocessingDrawing" xmlns:wp="http://schemas.openxmlformats.org/drawingml/2006/wordprocessingDrawing" xmlns:w10="urn:schemas-microsoft-com:office:word" xmlns:w="http://schemas.openxmlformats.org/wordprocessingml/2006/main" xmlns:w14="http://schemas.microsoft.com/office/word/2010/wordml" xmlns:w15="http://schemas.microsoft.com/office/word/2012/wordml" xmlns:w16cex="http://schemas.microsoft.com/office/word/2018/wordml/cex" xmlns:w16cid="http://schemas.microsoft.com/office/word/2016/wordml/cid" xmlns:w16="http://schemas.microsoft.com/office/word/2018/wordml" xmlns:w16se="http://schemas.microsoft.com/office/word/2015/wordml/symex" xmlns:wpg="http://schemas.microsoft.com/office/word/2010/wordprocessingGroup" xmlns:wpi="http://schemas.microsoft.com/office/word/2010/wordprocessingInk" xmlns:wne="http://schemas.microsoft.com/office/word/2006/wordml" xmlns:wps="http://schemas.microsoft.com/office/word/2010/wordprocessingShape" mc:Ignorable="w14 w15 w16se w16cid w16 w16cex wp14">
+<w:ftr xmlns:wpc="http://schemas.microsoft.com/office/word/2010/wordprocessingCanvas" xmlns:cx="http://schemas.microsoft.com/office/drawing/2014/chartex" xmlns:cx1="http://schemas.microsoft.com/office/drawing/2015/9/8/chartex" xmlns:cx2="http://schemas.microsoft.com/office/drawing/2015/10/21/chartex" xmlns:cx3="http://schemas.microsoft.com/office/drawing/2016/5/9/chartex" xmlns:cx4="http://schemas.microsoft.com/office/drawing/2016/5/10/chartex" xmlns:cx5="http://schemas.microsoft.com/office/drawing/2016/5/11/chartex" xmlns:cx6="http://schemas.microsoft.com/office/drawing/2016/5/12/chartex" xmlns:cx7="http://schemas.microsoft.com/office/drawing/2016/5/13/chartex" xmlns:cx8="http://schemas.microsoft.com/office/drawing/2016/5/14/chartex" xmlns:mc="http://schemas.openxmlformats.org/markup-compatibility/2006" xmlns:aink="http://schemas.microsoft.com/office/drawing/2016/ink" xmlns:am3d="http://schemas.microsoft.com/office/drawing/2017/model3d" xmlns:o="urn:schemas-microsoft-com:office:office" xmlns:oel="http://schemas.microsoft.com/office/2019/extlst" xmlns:r="http://schemas.openxmlformats.org/officeDocument/2006/relationships" xmlns:m="http://schemas.openxmlformats.org/officeDocument/2006/math" xmlns:v="urn:schemas-microsoft-com:vml" xmlns:wp14="http://schemas.microsoft.com/office/word/2010/wordprocessingDrawing" xmlns:wp="http://schemas.openxmlformats.org/drawingml/2006/wordprocessingDrawing" xmlns:w10="urn:schemas-microsoft-com:office:word" xmlns:w="http://schemas.openxmlformats.org/wordprocessingml/2006/main" xmlns:w14="http://schemas.microsoft.com/office/word/2010/wordml" xmlns:w15="http://schemas.microsoft.com/office/word/2012/wordml" xmlns:w16cex="http://schemas.microsoft.com/office/word/2018/wordml/cex" xmlns:w16cid="http://schemas.microsoft.com/office/word/2016/wordml/cid" xmlns:w16="http://schemas.microsoft.com/office/word/2018/wordml" xmlns:w16du="http://schemas.microsoft.com/office/word/2023/wordml/word16du" xmlns:w16sdtdh="http://schemas.microsoft.com/office/word/2020/wordml/sdtdatahash" xmlns:w16sdtfl="http://schemas.microsoft.com/office/word/2024/wordml/sdtformatlock" xmlns:w16se="http://schemas.microsoft.com/office/word/2015/wordml/symex" xmlns:wpg="http://schemas.microsoft.com/office/word/2010/wordprocessingGroup" xmlns:wpi="http://schemas.microsoft.com/office/word/2010/wordprocessingInk" xmlns:wne="http://schemas.microsoft.com/office/word/2006/wordml" xmlns:wps="http://schemas.microsoft.com/office/word/2010/wordprocessingShape" mc:Ignorable="w14 w15 w16se w16cid w16 w16cex w16sdtdh w16sdtfl w16du wp14">
   <w:p>
     <w:pPr>
       <w:pStyle w:val="Footer"/>
@@ -2677,7 +2604,7 @@
 </file>
 
 <file path=word/footnotes.xml><?xml version="1.0" encoding="utf-8"?>
-<w:footnotes xmlns:wpc="http://schemas.microsoft.com/office/word/2010/wordprocessingCanvas" xmlns:cx="http://schemas.microsoft.com/office/drawing/2014/chartex" xmlns:cx1="http://schemas.microsoft.com/office/drawing/2015/9/8/chartex" xmlns:cx2="http://schemas.microsoft.com/office/drawing/2015/10/21/chartex" xmlns:cx3="http://schemas.microsoft.com/office/drawing/2016/5/9/chartex" xmlns:cx4="http://schemas.microsoft.com/office/drawing/2016/5/10/chartex" xmlns:cx5="http://schemas.microsoft.com/office/drawing/2016/5/11/chartex" xmlns:cx6="http://schemas.microsoft.com/office/drawing/2016/5/12/chartex" xmlns:cx7="http://schemas.microsoft.com/office/drawing/2016/5/13/chartex" xmlns:cx8="http://schemas.microsoft.com/office/drawing/2016/5/14/chartex" xmlns:mc="http://schemas.openxmlformats.org/markup-compatibility/2006" xmlns:aink="http://schemas.microsoft.com/office/drawing/2016/ink" xmlns:am3d="http://schemas.microsoft.com/office/drawing/2017/model3d" xmlns:o="urn:schemas-microsoft-com:office:office" xmlns:r="http://schemas.openxmlformats.org/officeDocument/2006/relationships" xmlns:m="http://schemas.openxmlformats.org/officeDocument/2006/math" xmlns:v="urn:schemas-microsoft-com:vml" xmlns:wp14="http://schemas.microsoft.com/office/word/2010/wordprocessingDrawing" xmlns:wp="http://schemas.openxmlformats.org/drawingml/2006/wordprocessingDrawing" xmlns:w10="urn:schemas-microsoft-com:office:word" xmlns:w="http://schemas.openxmlformats.org/wordprocessingml/2006/main" xmlns:w14="http://schemas.microsoft.com/office/word/2010/wordml" xmlns:w15="http://schemas.microsoft.com/office/word/2012/wordml" xmlns:w16cex="http://schemas.microsoft.com/office/word/2018/wordml/cex" xmlns:w16cid="http://schemas.microsoft.com/office/word/2016/wordml/cid" xmlns:w16="http://schemas.microsoft.com/office/word/2018/wordml" xmlns:w16se="http://schemas.microsoft.com/office/word/2015/wordml/symex" xmlns:wpg="http://schemas.microsoft.com/office/word/2010/wordprocessingGroup" xmlns:wpi="http://schemas.microsoft.com/office/word/2010/wordprocessingInk" xmlns:wne="http://schemas.microsoft.com/office/word/2006/wordml" xmlns:wps="http://schemas.microsoft.com/office/word/2010/wordprocessingShape" mc:Ignorable="w14 w15 w16se w16cid w16 w16cex wp14">
+<w:footnotes xmlns:wpc="http://schemas.microsoft.com/office/word/2010/wordprocessingCanvas" xmlns:cx="http://schemas.microsoft.com/office/drawing/2014/chartex" xmlns:cx1="http://schemas.microsoft.com/office/drawing/2015/9/8/chartex" xmlns:cx2="http://schemas.microsoft.com/office/drawing/2015/10/21/chartex" xmlns:cx3="http://schemas.microsoft.com/office/drawing/2016/5/9/chartex" xmlns:cx4="http://schemas.microsoft.com/office/drawing/2016/5/10/chartex" xmlns:cx5="http://schemas.microsoft.com/office/drawing/2016/5/11/chartex" xmlns:cx6="http://schemas.microsoft.com/office/drawing/2016/5/12/chartex" xmlns:cx7="http://schemas.microsoft.com/office/drawing/2016/5/13/chartex" xmlns:cx8="http://schemas.microsoft.com/office/drawing/2016/5/14/chartex" xmlns:mc="http://schemas.openxmlformats.org/markup-compatibility/2006" xmlns:aink="http://schemas.microsoft.com/office/drawing/2016/ink" xmlns:am3d="http://schemas.microsoft.com/office/drawing/2017/model3d" xmlns:o="urn:schemas-microsoft-com:office:office" xmlns:oel="http://schemas.microsoft.com/office/2019/extlst" xmlns:r="http://schemas.openxmlformats.org/officeDocument/2006/relationships" xmlns:m="http://schemas.openxmlformats.org/officeDocument/2006/math" xmlns:v="urn:schemas-microsoft-com:vml" xmlns:wp14="http://schemas.microsoft.com/office/word/2010/wordprocessingDrawing" xmlns:wp="http://schemas.openxmlformats.org/drawingml/2006/wordprocessingDrawing" xmlns:w10="urn:schemas-microsoft-com:office:word" xmlns:w="http://schemas.openxmlformats.org/wordprocessingml/2006/main" xmlns:w14="http://schemas.microsoft.com/office/word/2010/wordml" xmlns:w15="http://schemas.microsoft.com/office/word/2012/wordml" xmlns:w16cex="http://schemas.microsoft.com/office/word/2018/wordml/cex" xmlns:w16cid="http://schemas.microsoft.com/office/word/2016/wordml/cid" xmlns:w16="http://schemas.microsoft.com/office/word/2018/wordml" xmlns:w16du="http://schemas.microsoft.com/office/word/2023/wordml/word16du" xmlns:w16sdtdh="http://schemas.microsoft.com/office/word/2020/wordml/sdtdatahash" xmlns:w16sdtfl="http://schemas.microsoft.com/office/word/2024/wordml/sdtformatlock" xmlns:w16se="http://schemas.microsoft.com/office/word/2015/wordml/symex" xmlns:wpg="http://schemas.microsoft.com/office/word/2010/wordprocessingGroup" xmlns:wpi="http://schemas.microsoft.com/office/word/2010/wordprocessingInk" xmlns:wne="http://schemas.microsoft.com/office/word/2006/wordml" xmlns:wps="http://schemas.microsoft.com/office/word/2010/wordprocessingShape" mc:Ignorable="w14 w15 w16se w16cid w16 w16cex w16sdtdh w16sdtfl w16du wp14">
   <w:footnote w:type="separator" w:id="-1">
     <w:p>
       <w:pPr>
@@ -2702,7 +2629,7 @@
 </file>
 
 <file path=word/header1.xml><?xml version="1.0" encoding="utf-8"?>
-<w:hdr xmlns:wpc="http://schemas.microsoft.com/office/word/2010/wordprocessingCanvas" xmlns:cx="http://schemas.microsoft.com/office/drawing/2014/chartex" xmlns:cx1="http://schemas.microsoft.com/office/drawing/2015/9/8/chartex" xmlns:cx2="http://schemas.microsoft.com/office/drawing/2015/10/21/chartex" xmlns:cx3="http://schemas.microsoft.com/office/drawing/2016/5/9/chartex" xmlns:cx4="http://schemas.microsoft.com/office/drawing/2016/5/10/chartex" xmlns:cx5="http://schemas.microsoft.com/office/drawing/2016/5/11/chartex" xmlns:cx6="http://schemas.microsoft.com/office/drawing/2016/5/12/chartex" xmlns:cx7="http://schemas.microsoft.com/office/drawing/2016/5/13/chartex" xmlns:cx8="http://schemas.microsoft.com/office/drawing/2016/5/14/chartex" xmlns:mc="http://schemas.openxmlformats.org/markup-compatibility/2006" xmlns:aink="http://schemas.microsoft.com/office/drawing/2016/ink" xmlns:am3d="http://schemas.microsoft.com/office/drawing/2017/model3d" xmlns:o="urn:schemas-microsoft-com:office:office" xmlns:r="http://schemas.openxmlformats.org/officeDocument/2006/relationships" xmlns:m="http://schemas.openxmlformats.org/officeDocument/2006/math" xmlns:v="urn:schemas-microsoft-com:vml" xmlns:wp14="http://schemas.microsoft.com/office/word/2010/wordprocessingDrawing" xmlns:wp="http://schemas.openxmlformats.org/drawingml/2006/wordprocessingDrawing" xmlns:w10="urn:schemas-microsoft-com:office:word" xmlns:w="http://schemas.openxmlformats.org/wordprocessingml/2006/main" xmlns:w14="http://schemas.microsoft.com/office/word/2010/wordml" xmlns:w15="http://schemas.microsoft.com/office/word/2012/wordml" xmlns:w16cex="http://schemas.microsoft.com/office/word/2018/wordml/cex" xmlns:w16cid="http://schemas.microsoft.com/office/word/2016/wordml/cid" xmlns:w16="http://schemas.microsoft.com/office/word/2018/wordml" xmlns:w16se="http://schemas.microsoft.com/office/word/2015/wordml/symex" xmlns:wpg="http://schemas.microsoft.com/office/word/2010/wordprocessingGroup" xmlns:wpi="http://schemas.microsoft.com/office/word/2010/wordprocessingInk" xmlns:wne="http://schemas.microsoft.com/office/word/2006/wordml" xmlns:wps="http://schemas.microsoft.com/office/word/2010/wordprocessingShape" mc:Ignorable="w14 w15 w16se w16cid w16 w16cex wp14">
+<w:hdr xmlns:wpc="http://schemas.microsoft.com/office/word/2010/wordprocessingCanvas" xmlns:cx="http://schemas.microsoft.com/office/drawing/2014/chartex" xmlns:cx1="http://schemas.microsoft.com/office/drawing/2015/9/8/chartex" xmlns:cx2="http://schemas.microsoft.com/office/drawing/2015/10/21/chartex" xmlns:cx3="http://schemas.microsoft.com/office/drawing/2016/5/9/chartex" xmlns:cx4="http://schemas.microsoft.com/office/drawing/2016/5/10/chartex" xmlns:cx5="http://schemas.microsoft.com/office/drawing/2016/5/11/chartex" xmlns:cx6="http://schemas.microsoft.com/office/drawing/2016/5/12/chartex" xmlns:cx7="http://schemas.microsoft.com/office/drawing/2016/5/13/chartex" xmlns:cx8="http://schemas.microsoft.com/office/drawing/2016/5/14/chartex" xmlns:mc="http://schemas.openxmlformats.org/markup-compatibility/2006" xmlns:aink="http://schemas.microsoft.com/office/drawing/2016/ink" xmlns:am3d="http://schemas.microsoft.com/office/drawing/2017/model3d" xmlns:o="urn:schemas-microsoft-com:office:office" xmlns:oel="http://schemas.microsoft.com/office/2019/extlst" xmlns:r="http://schemas.openxmlformats.org/officeDocument/2006/relationships" xmlns:m="http://schemas.openxmlformats.org/officeDocument/2006/math" xmlns:v="urn:schemas-microsoft-com:vml" xmlns:wp14="http://schemas.microsoft.com/office/word/2010/wordprocessingDrawing" xmlns:wp="http://schemas.openxmlformats.org/drawingml/2006/wordprocessingDrawing" xmlns:w10="urn:schemas-microsoft-com:office:word" xmlns:w="http://schemas.openxmlformats.org/wordprocessingml/2006/main" xmlns:w14="http://schemas.microsoft.com/office/word/2010/wordml" xmlns:w15="http://schemas.microsoft.com/office/word/2012/wordml" xmlns:w16cex="http://schemas.microsoft.com/office/word/2018/wordml/cex" xmlns:w16cid="http://schemas.microsoft.com/office/word/2016/wordml/cid" xmlns:w16="http://schemas.microsoft.com/office/word/2018/wordml" xmlns:w16du="http://schemas.microsoft.com/office/word/2023/wordml/word16du" xmlns:w16sdtdh="http://schemas.microsoft.com/office/word/2020/wordml/sdtdatahash" xmlns:w16sdtfl="http://schemas.microsoft.com/office/word/2024/wordml/sdtformatlock" xmlns:w16se="http://schemas.microsoft.com/office/word/2015/wordml/symex" xmlns:wpg="http://schemas.microsoft.com/office/word/2010/wordprocessingGroup" xmlns:wpi="http://schemas.microsoft.com/office/word/2010/wordprocessingInk" xmlns:wne="http://schemas.microsoft.com/office/word/2006/wordml" xmlns:wps="http://schemas.microsoft.com/office/word/2010/wordprocessingShape" mc:Ignorable="w14 w15 w16se w16cid w16 w16cex w16sdtdh w16sdtfl w16du wp14">
   <w:p>
     <w:pPr>
       <w:pStyle w:val="Header"/>
@@ -2732,7 +2659,7 @@
           <v:path o:extrusionok="f" gradientshapeok="t" o:connecttype="rect"/>
           <o:lock v:ext="edit" aspectratio="t"/>
         </v:shapetype>
-        <v:shape id="WordPictureWatermark19453235" o:spid="_x0000_s2052" type="#_x0000_t75" alt="" style="position:absolute;margin-left:0;margin-top:0;width:451.25pt;height:142.5pt;z-index:-251657728;mso-wrap-edited:f;mso-width-percent:0;mso-height-percent:0;mso-position-horizontal:center;mso-position-horizontal-relative:margin;mso-position-vertical:center;mso-position-vertical-relative:margin;mso-width-percent:0;mso-height-percent:0" o:allowincell="f">
+        <v:shape id="WordPictureWatermark19453235" o:spid="_x0000_s1028" type="#_x0000_t75" alt="" style="position:absolute;margin-left:0;margin-top:0;width:451.25pt;height:142.5pt;z-index:-251657728;mso-wrap-edited:f;mso-width-percent:0;mso-height-percent:0;mso-position-horizontal:center;mso-position-horizontal-relative:margin;mso-position-vertical:center;mso-position-vertical-relative:margin;mso-width-percent:0;mso-height-percent:0" o:allowincell="f">
           <v:imagedata r:id="rId1" o:title="insight1" gain="19661f" blacklevel="22938f"/>
           <w10:wrap anchorx="margin" anchory="margin"/>
         </v:shape>
@@ -2744,7 +2671,7 @@
         <w:lang w:eastAsia="en-GB"/>
       </w:rPr>
       <w:pict w14:anchorId="295448AE">
-        <v:shape id="WordPictureWatermark19312797" o:spid="_x0000_s2051" type="#_x0000_t75" alt="" style="position:absolute;margin-left:0;margin-top:0;width:451.2pt;height:146.1pt;z-index:-251659776;mso-wrap-edited:f;mso-width-percent:0;mso-height-percent:0;mso-position-horizontal:center;mso-position-horizontal-relative:margin;mso-position-vertical:center;mso-position-vertical-relative:margin;mso-width-percent:0;mso-height-percent:0" o:allowincell="f">
+        <v:shape id="WordPictureWatermark19312797" o:spid="_x0000_s1027" type="#_x0000_t75" alt="" style="position:absolute;margin-left:0;margin-top:0;width:451.2pt;height:146.1pt;z-index:-251659776;mso-wrap-edited:f;mso-width-percent:0;mso-height-percent:0;mso-position-horizontal:center;mso-position-horizontal-relative:margin;mso-position-vertical:center;mso-position-vertical-relative:margin;mso-width-percent:0;mso-height-percent:0" o:allowincell="f">
           <v:imagedata r:id="rId2" o:title="insight1" gain="19661f" blacklevel="22938f"/>
           <w10:wrap anchorx="margin" anchory="margin"/>
         </v:shape>
@@ -2755,7 +2682,7 @@
 </file>
 
 <file path=word/header2.xml><?xml version="1.0" encoding="utf-8"?>
-<w:hdr xmlns:wpc="http://schemas.microsoft.com/office/word/2010/wordprocessingCanvas" xmlns:cx="http://schemas.microsoft.com/office/drawing/2014/chartex" xmlns:cx1="http://schemas.microsoft.com/office/drawing/2015/9/8/chartex" xmlns:cx2="http://schemas.microsoft.com/office/drawing/2015/10/21/chartex" xmlns:cx3="http://schemas.microsoft.com/office/drawing/2016/5/9/chartex" xmlns:cx4="http://schemas.microsoft.com/office/drawing/2016/5/10/chartex" xmlns:cx5="http://schemas.microsoft.com/office/drawing/2016/5/11/chartex" xmlns:cx6="http://schemas.microsoft.com/office/drawing/2016/5/12/chartex" xmlns:cx7="http://schemas.microsoft.com/office/drawing/2016/5/13/chartex" xmlns:cx8="http://schemas.microsoft.com/office/drawing/2016/5/14/chartex" xmlns:mc="http://schemas.openxmlformats.org/markup-compatibility/2006" xmlns:aink="http://schemas.microsoft.com/office/drawing/2016/ink" xmlns:am3d="http://schemas.microsoft.com/office/drawing/2017/model3d" xmlns:o="urn:schemas-microsoft-com:office:office" xmlns:r="http://schemas.openxmlformats.org/officeDocument/2006/relationships" xmlns:m="http://schemas.openxmlformats.org/officeDocument/2006/math" xmlns:v="urn:schemas-microsoft-com:vml" xmlns:wp14="http://schemas.microsoft.com/office/word/2010/wordprocessingDrawing" xmlns:wp="http://schemas.openxmlformats.org/drawingml/2006/wordprocessingDrawing" xmlns:w10="urn:schemas-microsoft-com:office:word" xmlns:w="http://schemas.openxmlformats.org/wordprocessingml/2006/main" xmlns:w14="http://schemas.microsoft.com/office/word/2010/wordml" xmlns:w15="http://schemas.microsoft.com/office/word/2012/wordml" xmlns:w16cex="http://schemas.microsoft.com/office/word/2018/wordml/cex" xmlns:w16cid="http://schemas.microsoft.com/office/word/2016/wordml/cid" xmlns:w16="http://schemas.microsoft.com/office/word/2018/wordml" xmlns:w16se="http://schemas.microsoft.com/office/word/2015/wordml/symex" xmlns:wpg="http://schemas.microsoft.com/office/word/2010/wordprocessingGroup" xmlns:wpi="http://schemas.microsoft.com/office/word/2010/wordprocessingInk" xmlns:wne="http://schemas.microsoft.com/office/word/2006/wordml" xmlns:wps="http://schemas.microsoft.com/office/word/2010/wordprocessingShape" mc:Ignorable="w14 w15 w16se w16cid w16 w16cex wp14">
+<w:hdr xmlns:wpc="http://schemas.microsoft.com/office/word/2010/wordprocessingCanvas" xmlns:cx="http://schemas.microsoft.com/office/drawing/2014/chartex" xmlns:cx1="http://schemas.microsoft.com/office/drawing/2015/9/8/chartex" xmlns:cx2="http://schemas.microsoft.com/office/drawing/2015/10/21/chartex" xmlns:cx3="http://schemas.microsoft.com/office/drawing/2016/5/9/chartex" xmlns:cx4="http://schemas.microsoft.com/office/drawing/2016/5/10/chartex" xmlns:cx5="http://schemas.microsoft.com/office/drawing/2016/5/11/chartex" xmlns:cx6="http://schemas.microsoft.com/office/drawing/2016/5/12/chartex" xmlns:cx7="http://schemas.microsoft.com/office/drawing/2016/5/13/chartex" xmlns:cx8="http://schemas.microsoft.com/office/drawing/2016/5/14/chartex" xmlns:mc="http://schemas.openxmlformats.org/markup-compatibility/2006" xmlns:aink="http://schemas.microsoft.com/office/drawing/2016/ink" xmlns:am3d="http://schemas.microsoft.com/office/drawing/2017/model3d" xmlns:o="urn:schemas-microsoft-com:office:office" xmlns:oel="http://schemas.microsoft.com/office/2019/extlst" xmlns:r="http://schemas.openxmlformats.org/officeDocument/2006/relationships" xmlns:m="http://schemas.openxmlformats.org/officeDocument/2006/math" xmlns:v="urn:schemas-microsoft-com:vml" xmlns:wp14="http://schemas.microsoft.com/office/word/2010/wordprocessingDrawing" xmlns:wp="http://schemas.openxmlformats.org/drawingml/2006/wordprocessingDrawing" xmlns:w10="urn:schemas-microsoft-com:office:word" xmlns:w="http://schemas.openxmlformats.org/wordprocessingml/2006/main" xmlns:w14="http://schemas.microsoft.com/office/word/2010/wordml" xmlns:w15="http://schemas.microsoft.com/office/word/2012/wordml" xmlns:w16cex="http://schemas.microsoft.com/office/word/2018/wordml/cex" xmlns:w16cid="http://schemas.microsoft.com/office/word/2016/wordml/cid" xmlns:w16="http://schemas.microsoft.com/office/word/2018/wordml" xmlns:w16du="http://schemas.microsoft.com/office/word/2023/wordml/word16du" xmlns:w16sdtdh="http://schemas.microsoft.com/office/word/2020/wordml/sdtdatahash" xmlns:w16sdtfl="http://schemas.microsoft.com/office/word/2024/wordml/sdtformatlock" xmlns:w16se="http://schemas.microsoft.com/office/word/2015/wordml/symex" xmlns:wpg="http://schemas.microsoft.com/office/word/2010/wordprocessingGroup" xmlns:wpi="http://schemas.microsoft.com/office/word/2010/wordprocessingInk" xmlns:wne="http://schemas.microsoft.com/office/word/2006/wordml" xmlns:wps="http://schemas.microsoft.com/office/word/2010/wordprocessingShape" mc:Ignorable="w14 w15 w16se w16cid w16 w16cex w16sdtdh w16sdtfl w16du wp14">
   <w:p>
     <w:pPr>
       <w:pStyle w:val="Header"/>
@@ -3225,7 +3152,7 @@
 </file>
 
 <file path=word/header3.xml><?xml version="1.0" encoding="utf-8"?>
-<w:hdr xmlns:wpc="http://schemas.microsoft.com/office/word/2010/wordprocessingCanvas" xmlns:cx="http://schemas.microsoft.com/office/drawing/2014/chartex" xmlns:cx1="http://schemas.microsoft.com/office/drawing/2015/9/8/chartex" xmlns:cx2="http://schemas.microsoft.com/office/drawing/2015/10/21/chartex" xmlns:cx3="http://schemas.microsoft.com/office/drawing/2016/5/9/chartex" xmlns:cx4="http://schemas.microsoft.com/office/drawing/2016/5/10/chartex" xmlns:cx5="http://schemas.microsoft.com/office/drawing/2016/5/11/chartex" xmlns:cx6="http://schemas.microsoft.com/office/drawing/2016/5/12/chartex" xmlns:cx7="http://schemas.microsoft.com/office/drawing/2016/5/13/chartex" xmlns:cx8="http://schemas.microsoft.com/office/drawing/2016/5/14/chartex" xmlns:mc="http://schemas.openxmlformats.org/markup-compatibility/2006" xmlns:aink="http://schemas.microsoft.com/office/drawing/2016/ink" xmlns:am3d="http://schemas.microsoft.com/office/drawing/2017/model3d" xmlns:o="urn:schemas-microsoft-com:office:office" xmlns:r="http://schemas.openxmlformats.org/officeDocument/2006/relationships" xmlns:m="http://schemas.openxmlformats.org/officeDocument/2006/math" xmlns:v="urn:schemas-microsoft-com:vml" xmlns:wp14="http://schemas.microsoft.com/office/word/2010/wordprocessingDrawing" xmlns:wp="http://schemas.openxmlformats.org/drawingml/2006/wordprocessingDrawing" xmlns:w10="urn:schemas-microsoft-com:office:word" xmlns:w="http://schemas.openxmlformats.org/wordprocessingml/2006/main" xmlns:w14="http://schemas.microsoft.com/office/word/2010/wordml" xmlns:w15="http://schemas.microsoft.com/office/word/2012/wordml" xmlns:w16cex="http://schemas.microsoft.com/office/word/2018/wordml/cex" xmlns:w16cid="http://schemas.microsoft.com/office/word/2016/wordml/cid" xmlns:w16="http://schemas.microsoft.com/office/word/2018/wordml" xmlns:w16se="http://schemas.microsoft.com/office/word/2015/wordml/symex" xmlns:wpg="http://schemas.microsoft.com/office/word/2010/wordprocessingGroup" xmlns:wpi="http://schemas.microsoft.com/office/word/2010/wordprocessingInk" xmlns:wne="http://schemas.microsoft.com/office/word/2006/wordml" xmlns:wps="http://schemas.microsoft.com/office/word/2010/wordprocessingShape" mc:Ignorable="w14 w15 w16se w16cid w16 w16cex wp14">
+<w:hdr xmlns:wpc="http://schemas.microsoft.com/office/word/2010/wordprocessingCanvas" xmlns:cx="http://schemas.microsoft.com/office/drawing/2014/chartex" xmlns:cx1="http://schemas.microsoft.com/office/drawing/2015/9/8/chartex" xmlns:cx2="http://schemas.microsoft.com/office/drawing/2015/10/21/chartex" xmlns:cx3="http://schemas.microsoft.com/office/drawing/2016/5/9/chartex" xmlns:cx4="http://schemas.microsoft.com/office/drawing/2016/5/10/chartex" xmlns:cx5="http://schemas.microsoft.com/office/drawing/2016/5/11/chartex" xmlns:cx6="http://schemas.microsoft.com/office/drawing/2016/5/12/chartex" xmlns:cx7="http://schemas.microsoft.com/office/drawing/2016/5/13/chartex" xmlns:cx8="http://schemas.microsoft.com/office/drawing/2016/5/14/chartex" xmlns:mc="http://schemas.openxmlformats.org/markup-compatibility/2006" xmlns:aink="http://schemas.microsoft.com/office/drawing/2016/ink" xmlns:am3d="http://schemas.microsoft.com/office/drawing/2017/model3d" xmlns:o="urn:schemas-microsoft-com:office:office" xmlns:oel="http://schemas.microsoft.com/office/2019/extlst" xmlns:r="http://schemas.openxmlformats.org/officeDocument/2006/relationships" xmlns:m="http://schemas.openxmlformats.org/officeDocument/2006/math" xmlns:v="urn:schemas-microsoft-com:vml" xmlns:wp14="http://schemas.microsoft.com/office/word/2010/wordprocessingDrawing" xmlns:wp="http://schemas.openxmlformats.org/drawingml/2006/wordprocessingDrawing" xmlns:w10="urn:schemas-microsoft-com:office:word" xmlns:w="http://schemas.openxmlformats.org/wordprocessingml/2006/main" xmlns:w14="http://schemas.microsoft.com/office/word/2010/wordml" xmlns:w15="http://schemas.microsoft.com/office/word/2012/wordml" xmlns:w16cex="http://schemas.microsoft.com/office/word/2018/wordml/cex" xmlns:w16cid="http://schemas.microsoft.com/office/word/2016/wordml/cid" xmlns:w16="http://schemas.microsoft.com/office/word/2018/wordml" xmlns:w16du="http://schemas.microsoft.com/office/word/2023/wordml/word16du" xmlns:w16sdtdh="http://schemas.microsoft.com/office/word/2020/wordml/sdtdatahash" xmlns:w16sdtfl="http://schemas.microsoft.com/office/word/2024/wordml/sdtformatlock" xmlns:w16se="http://schemas.microsoft.com/office/word/2015/wordml/symex" xmlns:wpg="http://schemas.microsoft.com/office/word/2010/wordprocessingGroup" xmlns:wpi="http://schemas.microsoft.com/office/word/2010/wordprocessingInk" xmlns:wne="http://schemas.microsoft.com/office/word/2006/wordml" xmlns:wps="http://schemas.microsoft.com/office/word/2010/wordprocessingShape" mc:Ignorable="w14 w15 w16se w16cid w16 w16cex w16sdtdh w16sdtfl w16du wp14">
   <w:p>
     <w:pPr>
       <w:pStyle w:val="Header"/>
@@ -3255,7 +3182,7 @@
           <v:path o:extrusionok="f" gradientshapeok="t" o:connecttype="rect"/>
           <o:lock v:ext="edit" aspectratio="t"/>
         </v:shapetype>
-        <v:shape id="WordPictureWatermark19453234" o:spid="_x0000_s2050" type="#_x0000_t75" alt="" style="position:absolute;margin-left:0;margin-top:0;width:451.25pt;height:142.5pt;z-index:-251658752;mso-wrap-edited:f;mso-width-percent:0;mso-height-percent:0;mso-position-horizontal:center;mso-position-horizontal-relative:margin;mso-position-vertical:center;mso-position-vertical-relative:margin;mso-width-percent:0;mso-height-percent:0" o:allowincell="f">
+        <v:shape id="WordPictureWatermark19453234" o:spid="_x0000_s1026" type="#_x0000_t75" alt="" style="position:absolute;margin-left:0;margin-top:0;width:451.25pt;height:142.5pt;z-index:-251658752;mso-wrap-edited:f;mso-width-percent:0;mso-height-percent:0;mso-position-horizontal:center;mso-position-horizontal-relative:margin;mso-position-vertical:center;mso-position-vertical-relative:margin;mso-width-percent:0;mso-height-percent:0" o:allowincell="f">
           <v:imagedata r:id="rId1" o:title="insight1" gain="19661f" blacklevel="22938f"/>
           <w10:wrap anchorx="margin" anchory="margin"/>
         </v:shape>
@@ -3267,7 +3194,7 @@
         <w:lang w:eastAsia="en-GB"/>
       </w:rPr>
       <w:pict w14:anchorId="5C2A3A69">
-        <v:shape id="WordPictureWatermark19312796" o:spid="_x0000_s2049" type="#_x0000_t75" alt="" style="position:absolute;margin-left:0;margin-top:0;width:451.2pt;height:146.1pt;z-index:-251660800;mso-wrap-edited:f;mso-width-percent:0;mso-height-percent:0;mso-position-horizontal:center;mso-position-horizontal-relative:margin;mso-position-vertical:center;mso-position-vertical-relative:margin;mso-width-percent:0;mso-height-percent:0" o:allowincell="f">
+        <v:shape id="WordPictureWatermark19312796" o:spid="_x0000_s1025" type="#_x0000_t75" alt="" style="position:absolute;margin-left:0;margin-top:0;width:451.2pt;height:146.1pt;z-index:-251660800;mso-wrap-edited:f;mso-width-percent:0;mso-height-percent:0;mso-position-horizontal:center;mso-position-horizontal-relative:margin;mso-position-vertical:center;mso-position-vertical-relative:margin;mso-width-percent:0;mso-height-percent:0" o:allowincell="f">
           <v:imagedata r:id="rId2" o:title="insight1" gain="19661f" blacklevel="22938f"/>
           <w10:wrap anchorx="margin" anchory="margin"/>
         </v:shape>
@@ -3278,7 +3205,7 @@
 </file>
 
 <file path=word/numbering.xml><?xml version="1.0" encoding="utf-8"?>
-<w:numbering xmlns:wpc="http://schemas.microsoft.com/office/word/2010/wordprocessingCanvas" xmlns:cx="http://schemas.microsoft.com/office/drawing/2014/chartex" xmlns:cx1="http://schemas.microsoft.com/office/drawing/2015/9/8/chartex" xmlns:cx2="http://schemas.microsoft.com/office/drawing/2015/10/21/chartex" xmlns:cx3="http://schemas.microsoft.com/office/drawing/2016/5/9/chartex" xmlns:cx4="http://schemas.microsoft.com/office/drawing/2016/5/10/chartex" xmlns:cx5="http://schemas.microsoft.com/office/drawing/2016/5/11/chartex" xmlns:cx6="http://schemas.microsoft.com/office/drawing/2016/5/12/chartex" xmlns:cx7="http://schemas.microsoft.com/office/drawing/2016/5/13/chartex" xmlns:cx8="http://schemas.microsoft.com/office/drawing/2016/5/14/chartex" xmlns:mc="http://schemas.openxmlformats.org/markup-compatibility/2006" xmlns:aink="http://schemas.microsoft.com/office/drawing/2016/ink" xmlns:am3d="http://schemas.microsoft.com/office/drawing/2017/model3d" xmlns:o="urn:schemas-microsoft-com:office:office" xmlns:r="http://schemas.openxmlformats.org/officeDocument/2006/relationships" xmlns:m="http://schemas.openxmlformats.org/officeDocument/2006/math" xmlns:v="urn:schemas-microsoft-com:vml" xmlns:wp14="http://schemas.microsoft.com/office/word/2010/wordprocessingDrawing" xmlns:wp="http://schemas.openxmlformats.org/drawingml/2006/wordprocessingDrawing" xmlns:w10="urn:schemas-microsoft-com:office:word" xmlns:w="http://schemas.openxmlformats.org/wordprocessingml/2006/main" xmlns:w14="http://schemas.microsoft.com/office/word/2010/wordml" xmlns:w15="http://schemas.microsoft.com/office/word/2012/wordml" xmlns:w16cex="http://schemas.microsoft.com/office/word/2018/wordml/cex" xmlns:w16cid="http://schemas.microsoft.com/office/word/2016/wordml/cid" xmlns:w16="http://schemas.microsoft.com/office/word/2018/wordml" xmlns:w16se="http://schemas.microsoft.com/office/word/2015/wordml/symex" xmlns:wpg="http://schemas.microsoft.com/office/word/2010/wordprocessingGroup" xmlns:wpi="http://schemas.microsoft.com/office/word/2010/wordprocessingInk" xmlns:wne="http://schemas.microsoft.com/office/word/2006/wordml" xmlns:wps="http://schemas.microsoft.com/office/word/2010/wordprocessingShape" mc:Ignorable="w14 w15 w16se w16cid w16 w16cex wp14">
+<w:numbering xmlns:wpc="http://schemas.microsoft.com/office/word/2010/wordprocessingCanvas" xmlns:cx="http://schemas.microsoft.com/office/drawing/2014/chartex" xmlns:cx1="http://schemas.microsoft.com/office/drawing/2015/9/8/chartex" xmlns:cx2="http://schemas.microsoft.com/office/drawing/2015/10/21/chartex" xmlns:cx3="http://schemas.microsoft.com/office/drawing/2016/5/9/chartex" xmlns:cx4="http://schemas.microsoft.com/office/drawing/2016/5/10/chartex" xmlns:cx5="http://schemas.microsoft.com/office/drawing/2016/5/11/chartex" xmlns:cx6="http://schemas.microsoft.com/office/drawing/2016/5/12/chartex" xmlns:cx7="http://schemas.microsoft.com/office/drawing/2016/5/13/chartex" xmlns:cx8="http://schemas.microsoft.com/office/drawing/2016/5/14/chartex" xmlns:mc="http://schemas.openxmlformats.org/markup-compatibility/2006" xmlns:aink="http://schemas.microsoft.com/office/drawing/2016/ink" xmlns:am3d="http://schemas.microsoft.com/office/drawing/2017/model3d" xmlns:o="urn:schemas-microsoft-com:office:office" xmlns:oel="http://schemas.microsoft.com/office/2019/extlst" xmlns:r="http://schemas.openxmlformats.org/officeDocument/2006/relationships" xmlns:m="http://schemas.openxmlformats.org/officeDocument/2006/math" xmlns:v="urn:schemas-microsoft-com:vml" xmlns:wp14="http://schemas.microsoft.com/office/word/2010/wordprocessingDrawing" xmlns:wp="http://schemas.openxmlformats.org/drawingml/2006/wordprocessingDrawing" xmlns:w10="urn:schemas-microsoft-com:office:word" xmlns:w="http://schemas.openxmlformats.org/wordprocessingml/2006/main" xmlns:w14="http://schemas.microsoft.com/office/word/2010/wordml" xmlns:w15="http://schemas.microsoft.com/office/word/2012/wordml" xmlns:w16cex="http://schemas.microsoft.com/office/word/2018/wordml/cex" xmlns:w16cid="http://schemas.microsoft.com/office/word/2016/wordml/cid" xmlns:w16="http://schemas.microsoft.com/office/word/2018/wordml" xmlns:w16du="http://schemas.microsoft.com/office/word/2023/wordml/word16du" xmlns:w16sdtdh="http://schemas.microsoft.com/office/word/2020/wordml/sdtdatahash" xmlns:w16sdtfl="http://schemas.microsoft.com/office/word/2024/wordml/sdtformatlock" xmlns:w16se="http://schemas.microsoft.com/office/word/2015/wordml/symex" xmlns:wpg="http://schemas.microsoft.com/office/word/2010/wordprocessingGroup" xmlns:wpi="http://schemas.microsoft.com/office/word/2010/wordprocessingInk" xmlns:wne="http://schemas.microsoft.com/office/word/2006/wordml" xmlns:wps="http://schemas.microsoft.com/office/word/2010/wordprocessingShape" mc:Ignorable="w14 w15 w16se w16cid w16 w16cex w16sdtdh w16sdtfl w16du wp14">
   <w:abstractNum w:abstractNumId="0" w15:restartNumberingAfterBreak="0">
     <w:nsid w:val="00903EA0"/>
     <w:multiLevelType w:val="hybridMultilevel"/>
@@ -6207,61 +6134,61 @@
       </w:rPr>
     </w:lvl>
   </w:abstractNum>
-  <w:num w:numId="1">
+  <w:num w:numId="1" w16cid:durableId="175271690">
     <w:abstractNumId w:val="2"/>
   </w:num>
-  <w:num w:numId="2">
+  <w:num w:numId="2" w16cid:durableId="1027217989">
     <w:abstractNumId w:val="23"/>
   </w:num>
-  <w:num w:numId="3">
+  <w:num w:numId="3" w16cid:durableId="1109087474">
     <w:abstractNumId w:val="26"/>
   </w:num>
-  <w:num w:numId="4">
+  <w:num w:numId="4" w16cid:durableId="1085304024">
     <w:abstractNumId w:val="7"/>
   </w:num>
-  <w:num w:numId="5">
+  <w:num w:numId="5" w16cid:durableId="1070037670">
     <w:abstractNumId w:val="12"/>
   </w:num>
-  <w:num w:numId="6">
+  <w:num w:numId="6" w16cid:durableId="953294254">
     <w:abstractNumId w:val="14"/>
   </w:num>
-  <w:num w:numId="7">
+  <w:num w:numId="7" w16cid:durableId="1866022245">
     <w:abstractNumId w:val="11"/>
   </w:num>
-  <w:num w:numId="8">
+  <w:num w:numId="8" w16cid:durableId="643701582">
     <w:abstractNumId w:val="10"/>
   </w:num>
-  <w:num w:numId="9">
+  <w:num w:numId="9" w16cid:durableId="791485104">
     <w:abstractNumId w:val="3"/>
   </w:num>
-  <w:num w:numId="10">
+  <w:num w:numId="10" w16cid:durableId="843279196">
     <w:abstractNumId w:val="4"/>
   </w:num>
-  <w:num w:numId="11">
+  <w:num w:numId="11" w16cid:durableId="1061830159">
     <w:abstractNumId w:val="8"/>
   </w:num>
-  <w:num w:numId="12">
+  <w:num w:numId="12" w16cid:durableId="1876843904">
     <w:abstractNumId w:val="0"/>
   </w:num>
-  <w:num w:numId="13">
+  <w:num w:numId="13" w16cid:durableId="1636331330">
     <w:abstractNumId w:val="6"/>
   </w:num>
-  <w:num w:numId="14">
+  <w:num w:numId="14" w16cid:durableId="1909458588">
     <w:abstractNumId w:val="25"/>
   </w:num>
-  <w:num w:numId="15">
+  <w:num w:numId="15" w16cid:durableId="777414159">
     <w:abstractNumId w:val="5"/>
   </w:num>
-  <w:num w:numId="16">
+  <w:num w:numId="16" w16cid:durableId="1327785450">
     <w:abstractNumId w:val="20"/>
   </w:num>
-  <w:num w:numId="17">
+  <w:num w:numId="17" w16cid:durableId="1880431889">
     <w:abstractNumId w:val="16"/>
   </w:num>
-  <w:num w:numId="18">
+  <w:num w:numId="18" w16cid:durableId="953511869">
     <w:abstractNumId w:val="15"/>
   </w:num>
-  <w:num w:numId="19">
+  <w:num w:numId="19" w16cid:durableId="1295522274">
     <w:abstractNumId w:val="19"/>
     <w:lvlOverride w:ilvl="0">
       <w:startOverride w:val="1"/>
@@ -6291,19 +6218,19 @@
       <w:startOverride w:val="1"/>
     </w:lvlOverride>
   </w:num>
-  <w:num w:numId="20">
+  <w:num w:numId="20" w16cid:durableId="679888691">
     <w:abstractNumId w:val="20"/>
   </w:num>
-  <w:num w:numId="21">
+  <w:num w:numId="21" w16cid:durableId="2025278018">
     <w:abstractNumId w:val="16"/>
   </w:num>
-  <w:num w:numId="22">
+  <w:num w:numId="22" w16cid:durableId="414015461">
     <w:abstractNumId w:val="18"/>
   </w:num>
-  <w:num w:numId="23">
+  <w:num w:numId="23" w16cid:durableId="1560437732">
     <w:abstractNumId w:val="24"/>
   </w:num>
-  <w:num w:numId="24">
+  <w:num w:numId="24" w16cid:durableId="1242325262">
     <w:abstractNumId w:val="13"/>
     <w:lvlOverride w:ilvl="0"/>
     <w:lvlOverride w:ilvl="1">
@@ -6331,29 +6258,29 @@
       <w:startOverride w:val="1"/>
     </w:lvlOverride>
   </w:num>
-  <w:num w:numId="25">
+  <w:num w:numId="25" w16cid:durableId="909921956">
     <w:abstractNumId w:val="1"/>
   </w:num>
-  <w:num w:numId="26">
+  <w:num w:numId="26" w16cid:durableId="1575048508">
     <w:abstractNumId w:val="27"/>
   </w:num>
-  <w:num w:numId="27">
+  <w:num w:numId="27" w16cid:durableId="1420519747">
     <w:abstractNumId w:val="9"/>
   </w:num>
-  <w:num w:numId="28">
+  <w:num w:numId="28" w16cid:durableId="1883250275">
     <w:abstractNumId w:val="21"/>
   </w:num>
-  <w:num w:numId="29">
+  <w:num w:numId="29" w16cid:durableId="742607522">
     <w:abstractNumId w:val="22"/>
   </w:num>
-  <w:num w:numId="30">
+  <w:num w:numId="30" w16cid:durableId="169416148">
     <w:abstractNumId w:val="17"/>
   </w:num>
 </w:numbering>
 </file>
 
 <file path=word/styles.xml><?xml version="1.0" encoding="utf-8"?>
-<w:styles xmlns:mc="http://schemas.openxmlformats.org/markup-compatibility/2006" xmlns:r="http://schemas.openxmlformats.org/officeDocument/2006/relationships" xmlns:w="http://schemas.openxmlformats.org/wordprocessingml/2006/main" xmlns:w14="http://schemas.microsoft.com/office/word/2010/wordml" xmlns:w15="http://schemas.microsoft.com/office/word/2012/wordml" xmlns:w16cex="http://schemas.microsoft.com/office/word/2018/wordml/cex" xmlns:w16cid="http://schemas.microsoft.com/office/word/2016/wordml/cid" xmlns:w16="http://schemas.microsoft.com/office/word/2018/wordml" xmlns:w16se="http://schemas.microsoft.com/office/word/2015/wordml/symex" mc:Ignorable="w14 w15 w16se w16cid w16 w16cex">
+<w:styles xmlns:mc="http://schemas.openxmlformats.org/markup-compatibility/2006" xmlns:r="http://schemas.openxmlformats.org/officeDocument/2006/relationships" xmlns:w="http://schemas.openxmlformats.org/wordprocessingml/2006/main" xmlns:w14="http://schemas.microsoft.com/office/word/2010/wordml" xmlns:w15="http://schemas.microsoft.com/office/word/2012/wordml" xmlns:w16cex="http://schemas.microsoft.com/office/word/2018/wordml/cex" xmlns:w16cid="http://schemas.microsoft.com/office/word/2016/wordml/cid" xmlns:w16="http://schemas.microsoft.com/office/word/2018/wordml" xmlns:w16du="http://schemas.microsoft.com/office/word/2023/wordml/word16du" xmlns:w16sdtdh="http://schemas.microsoft.com/office/word/2020/wordml/sdtdatahash" xmlns:w16sdtfl="http://schemas.microsoft.com/office/word/2024/wordml/sdtformatlock" xmlns:w16se="http://schemas.microsoft.com/office/word/2015/wordml/symex" mc:Ignorable="w14 w15 w16se w16cid w16 w16cex w16sdtdh w16sdtfl w16du">
   <w:docDefaults>
     <w:rPrDefault>
       <w:rPr>
@@ -7466,6 +7393,10 @@
 </file>
 
 <file path=customXml/item1.xml><?xml version="1.0" encoding="utf-8"?>
+<b:Sources xmlns:b="http://schemas.openxmlformats.org/officeDocument/2006/bibliography" xmlns="http://schemas.openxmlformats.org/officeDocument/2006/bibliography" SelectedStyle="\APA.XSL" StyleName="APA"/>
+</file>
+
+<file path=customXml/item2.xml><?xml version="1.0" encoding="utf-8"?>
 <ct:contentTypeSchema xmlns:ct="http://schemas.microsoft.com/office/2006/metadata/contentType" xmlns:ma="http://schemas.microsoft.com/office/2006/metadata/properties/metaAttributes" ct:_="" ma:_="" ma:contentTypeName="Document" ma:contentTypeID="0x010100A0FAC1C861DD5E4C8176498895062390" ma:contentTypeVersion="4" ma:contentTypeDescription="Create a new document." ma:contentTypeScope="" ma:versionID="5a9d447c12e9f3c6b742b72324c97e03">
   <xsd:schema xmlns:xsd="http://www.w3.org/2001/XMLSchema" xmlns:xs="http://www.w3.org/2001/XMLSchema" xmlns:p="http://schemas.microsoft.com/office/2006/metadata/properties" xmlns:ns2="5cae62c7-6809-43cb-9644-0327197256ff" xmlns:ns3="0c30bb0c-f182-4f5c-90d2-215cacb632e9" targetNamespace="http://schemas.microsoft.com/office/2006/metadata/properties" ma:root="true" ma:fieldsID="225809a789518f698fd4418059cc1b10" ns2:_="" ns3:_="">
     <xsd:import namespace="5cae62c7-6809-43cb-9644-0327197256ff"/>
@@ -7717,17 +7648,9 @@
 </ct:contentTypeSchema>
 </file>
 
-<file path=customXml/item2.xml><?xml version="1.0" encoding="utf-8"?>
-<b:Sources xmlns:b="http://schemas.openxmlformats.org/officeDocument/2006/bibliography" xmlns="http://schemas.openxmlformats.org/officeDocument/2006/bibliography" SelectedStyle="\APA.XSL" StyleName="APA"/>
-</file>
-
 <file path=customXml/item3.xml><?xml version="1.0" encoding="utf-8"?>
 <?mso-contentType ?>
-<FormTemplates xmlns="http://schemas.microsoft.com/sharepoint/v3/contenttype/forms">
-  <Display>DocumentLibraryForm</Display>
-  <Edit>DocumentLibraryForm</Edit>
-  <New>DocumentLibraryForm</New>
-</FormTemplates>
+<spe:Receivers xmlns:spe="http://schemas.microsoft.com/sharepoint/events"/>
 </file>
 
 <file path=customXml/item4.xml><?xml version="1.0" encoding="utf-8"?>
@@ -7768,10 +7691,22 @@
 
 <file path=customXml/item5.xml><?xml version="1.0" encoding="utf-8"?>
 <?mso-contentType ?>
-<spe:Receivers xmlns:spe="http://schemas.microsoft.com/sharepoint/events"/>
+<FormTemplates xmlns="http://schemas.microsoft.com/sharepoint/v3/contenttype/forms">
+  <Display>DocumentLibraryForm</Display>
+  <Edit>DocumentLibraryForm</Edit>
+  <New>DocumentLibraryForm</New>
+</FormTemplates>
 </file>
 
 <file path=customXml/itemProps1.xml><?xml version="1.0" encoding="utf-8"?>
+<ds:datastoreItem xmlns:ds="http://schemas.openxmlformats.org/officeDocument/2006/customXml" ds:itemID="{C6D0AAC8-113C-4E31-A76B-A7E6F2BD8B9B}">
+  <ds:schemaRefs>
+    <ds:schemaRef ds:uri="http://schemas.openxmlformats.org/officeDocument/2006/bibliography"/>
+  </ds:schemaRefs>
+</ds:datastoreItem>
+</file>
+
+<file path=customXml/itemProps2.xml><?xml version="1.0" encoding="utf-8"?>
 <ds:datastoreItem xmlns:ds="http://schemas.openxmlformats.org/officeDocument/2006/customXml" ds:itemID="{8B65C597-F9FA-45BC-9380-7E9B01E849D2}">
   <ds:schemaRefs>
     <ds:schemaRef ds:uri="http://schemas.microsoft.com/office/2006/metadata/contentType"/>
@@ -7790,18 +7725,10 @@
 </ds:datastoreItem>
 </file>
 
-<file path=customXml/itemProps2.xml><?xml version="1.0" encoding="utf-8"?>
-<ds:datastoreItem xmlns:ds="http://schemas.openxmlformats.org/officeDocument/2006/customXml" ds:itemID="{C6D0AAC8-113C-4E31-A76B-A7E6F2BD8B9B}">
+<file path=customXml/itemProps3.xml><?xml version="1.0" encoding="utf-8"?>
+<ds:datastoreItem xmlns:ds="http://schemas.openxmlformats.org/officeDocument/2006/customXml" ds:itemID="{0DCE7F10-6DF9-489A-8F17-1C0227DE817B}">
   <ds:schemaRefs>
-    <ds:schemaRef ds:uri="http://schemas.openxmlformats.org/officeDocument/2006/bibliography"/>
-  </ds:schemaRefs>
-</ds:datastoreItem>
-</file>
-
-<file path=customXml/itemProps3.xml><?xml version="1.0" encoding="utf-8"?>
-<ds:datastoreItem xmlns:ds="http://schemas.openxmlformats.org/officeDocument/2006/customXml" ds:itemID="{CF769ED2-2387-422E-BFA9-158527CB6986}">
-  <ds:schemaRefs>
-    <ds:schemaRef ds:uri="http://schemas.microsoft.com/sharepoint/v3/contenttype/forms"/>
+    <ds:schemaRef ds:uri="http://schemas.microsoft.com/sharepoint/events"/>
   </ds:schemaRefs>
 </ds:datastoreItem>
 </file>
@@ -7818,9 +7745,9 @@
 </file>
 
 <file path=customXml/itemProps5.xml><?xml version="1.0" encoding="utf-8"?>
-<ds:datastoreItem xmlns:ds="http://schemas.openxmlformats.org/officeDocument/2006/customXml" ds:itemID="{0DCE7F10-6DF9-489A-8F17-1C0227DE817B}">
+<ds:datastoreItem xmlns:ds="http://schemas.openxmlformats.org/officeDocument/2006/customXml" ds:itemID="{CF769ED2-2387-422E-BFA9-158527CB6986}">
   <ds:schemaRefs>
-    <ds:schemaRef ds:uri="http://schemas.microsoft.com/sharepoint/events"/>
+    <ds:schemaRef ds:uri="http://schemas.microsoft.com/sharepoint/v3/contenttype/forms"/>
   </ds:schemaRefs>
 </ds:datastoreItem>
 </file>
</xml_diff>